<commit_message>
feat: add Technical Lead position at Infrared with detailed responsibilities to resume
</commit_message>
<xml_diff>
--- a/output/John_Young_Resume.docx
+++ b/output/John_Young_Resume.docx
@@ -116,9 +116,9 @@
       <w:pPr>
         <w:pStyle w:val="Heading3"/>
       </w:pPr>
-      <w:bookmarkStart w:id="26" w:name="chief-technology-officer"/>
-      <w:r>
-        <w:t xml:space="preserve">Chief Technology Officer</w:t>
+      <w:bookmarkStart w:id="26" w:name="technical-lead"/>
+      <w:r>
+        <w:t xml:space="preserve">Technical Lead</w:t>
       </w:r>
       <w:bookmarkEnd w:id="26"/>
     </w:p>
@@ -130,7 +130,7 @@
         <w:rPr>
           <w:b/>
         </w:rPr>
-        <w:t xml:space="preserve">Combine Capital</w:t>
+        <w:t xml:space="preserve">Infrared</w:t>
       </w:r>
       <w:r>
         <w:t xml:space="preserve"> </w:t>
@@ -145,7 +145,7 @@
         <w:rPr>
           <w:i/>
         </w:rPr>
-        <w:t xml:space="preserve">January 2023 - Present</w:t>
+        <w:t xml:space="preserve">December 2025 - Present</w:t>
       </w:r>
     </w:p>
     <w:p>
@@ -157,22 +157,16 @@
         <w:pStyle w:val="Compact"/>
       </w:pPr>
       <w:r>
-        <w:t xml:space="preserve">Implemented a robust multi-agent system that streamlined data processing, achieving a</w:t>
-      </w:r>
-      <w:r>
-        <w:t xml:space="preserve"> </w:t>
-      </w:r>
-      <w:r>
-        <w:rPr>
-          <w:b/>
-        </w:rPr>
-        <w:t xml:space="preserve">75% reduction in analysis time</w:t>
-      </w:r>
-      <w:r>
-        <w:t xml:space="preserve"> </w:t>
-      </w:r>
-      <w:r>
-        <w:t xml:space="preserve">and increasing decision-making speed within 3 months</w:t>
+        <w:t xml:space="preserve">Architecting a unified MIMO token router that models swaps, deposits, and LP operations as arcs in a single flow network, eliminating suboptimal sequential solving across</w:t>
+      </w:r>
+      <w:r>
+        <w:t xml:space="preserve"> </w:t>
+      </w:r>
+      <w:r>
+        <w:rPr>
+          <w:b/>
+        </w:rPr>
+        <w:t xml:space="preserve">50+ liquidity sources</w:t>
       </w:r>
     </w:p>
     <w:p>
@@ -184,22 +178,31 @@
         <w:pStyle w:val="Compact"/>
       </w:pPr>
       <w:r>
-        <w:t xml:space="preserve">Fine-tuned LLMs to explain complex DeFi transactions in plain English, improving investigation efficiency by</w:t>
-      </w:r>
-      <w:r>
-        <w:t xml:space="preserve"> </w:t>
-      </w:r>
-      <w:r>
-        <w:rPr>
-          <w:b/>
-        </w:rPr>
-        <w:t xml:space="preserve">65%</w:t>
-      </w:r>
-      <w:r>
-        <w:t xml:space="preserve"> </w:t>
-      </w:r>
-      <w:r>
-        <w:t xml:space="preserve">for compliance reviews</w:t>
+        <w:t xml:space="preserve">Implementing min-cost flow optimization with capacity scaling, reducing algorithmic complexity to</w:t>
+      </w:r>
+      <w:r>
+        <w:t xml:space="preserve"> </w:t>
+      </w:r>
+      <w:r>
+        <w:rPr>
+          <w:b/>
+        </w:rPr>
+        <w:t xml:space="preserve">O((V+E) × log U)</w:t>
+      </w:r>
+      <w:r>
+        <w:t xml:space="preserve"> </w:t>
+      </w:r>
+      <w:r>
+        <w:t xml:space="preserve">for handling ERC-20 amounts at</w:t>
+      </w:r>
+      <w:r>
+        <w:t xml:space="preserve"> </w:t>
+      </w:r>
+      <w:r>
+        <w:rPr>
+          <w:b/>
+        </w:rPr>
+        <w:t xml:space="preserve">10^18 precision</w:t>
       </w:r>
     </w:p>
     <w:p>
@@ -211,16 +214,37 @@
         <w:pStyle w:val="Compact"/>
       </w:pPr>
       <w:r>
-        <w:t xml:space="preserve">Built ReAct-based agentic workflow automation for complex DeFi transactions, integrating dynamic slippage optimization and MEV protection across</w:t>
-      </w:r>
-      <w:r>
-        <w:t xml:space="preserve"> </w:t>
-      </w:r>
-      <w:r>
-        <w:rPr>
-          <w:b/>
-        </w:rPr>
-        <w:t xml:space="preserve">10+ protocols</w:t>
+        <w:t xml:space="preserve">Designing piecewise linear cost approximation with configurable segment counts, achieving</w:t>
+      </w:r>
+      <w:r>
+        <w:t xml:space="preserve"> </w:t>
+      </w:r>
+      <w:r>
+        <w:rPr>
+          <w:b/>
+        </w:rPr>
+        <w:t xml:space="preserve">&lt;1% slippage estimation error</w:t>
+      </w:r>
+      <w:r>
+        <w:t xml:space="preserve"> </w:t>
+      </w:r>
+      <w:r>
+        <w:t xml:space="preserve">while maintaining</w:t>
+      </w:r>
+      <w:r>
+        <w:t xml:space="preserve"> </w:t>
+      </w:r>
+      <w:r>
+        <w:rPr>
+          <w:b/>
+        </w:rPr>
+        <w:t xml:space="preserve">sub-100ms</w:t>
+      </w:r>
+      <w:r>
+        <w:t xml:space="preserve"> </w:t>
+      </w:r>
+      <w:r>
+        <w:t xml:space="preserve">route computation</w:t>
       </w:r>
     </w:p>
     <w:p>
@@ -232,22 +256,22 @@
         <w:pStyle w:val="Compact"/>
       </w:pPr>
       <w:r>
-        <w:t xml:space="preserve">Developed an end-to-end data infrastructure that processed</w:t>
-      </w:r>
-      <w:r>
-        <w:t xml:space="preserve"> </w:t>
-      </w:r>
-      <w:r>
-        <w:rPr>
-          <w:b/>
-        </w:rPr>
-        <w:t xml:space="preserve">100K+ daily events</w:t>
-      </w:r>
-      <w:r>
-        <w:t xml:space="preserve"> </w:t>
-      </w:r>
-      <w:r>
-        <w:t xml:space="preserve">across multiple EVM chains and CEXs, enhancing data accessibility within 6 months</w:t>
+        <w:t xml:space="preserve">Engineering discretized bundle nodes for LP composition, enabling the optimizer to evaluate</w:t>
+      </w:r>
+      <w:r>
+        <w:t xml:space="preserve"> </w:t>
+      </w:r>
+      <w:r>
+        <w:rPr>
+          <w:b/>
+        </w:rPr>
+        <w:t xml:space="preserve">11 ratio configurations</w:t>
+      </w:r>
+      <w:r>
+        <w:t xml:space="preserve"> </w:t>
+      </w:r>
+      <w:r>
+        <w:t xml:space="preserve">per pool and discover optimal token allocations dynamically</w:t>
       </w:r>
     </w:p>
     <w:p>
@@ -259,16 +283,25 @@
         <w:pStyle w:val="Compact"/>
       </w:pPr>
       <w:r>
-        <w:t xml:space="preserve">Led technical due diligence for portfolio investments</w:t>
+        <w:t xml:space="preserve">Building gas-aware cost modeling that factors execution overhead into routing decisions, optimizing net output for trade sizes from</w:t>
+      </w:r>
+      <w:r>
+        <w:t xml:space="preserve"> </w:t>
+      </w:r>
+      <w:r>
+        <w:rPr>
+          <w:b/>
+        </w:rPr>
+        <w:t xml:space="preserve">$10K to $500K+</w:t>
       </w:r>
     </w:p>
     <w:p>
       <w:pPr>
         <w:pStyle w:val="Heading3"/>
       </w:pPr>
-      <w:bookmarkStart w:id="27" w:name="software-engineer"/>
-      <w:r>
-        <w:t xml:space="preserve">Software Engineer</w:t>
+      <w:bookmarkStart w:id="27" w:name="chief-technology-officer"/>
+      <w:r>
+        <w:t xml:space="preserve">Chief Technology Officer</w:t>
       </w:r>
       <w:bookmarkEnd w:id="27"/>
     </w:p>
@@ -280,7 +313,7 @@
         <w:rPr>
           <w:b/>
         </w:rPr>
-        <w:t xml:space="preserve">FRACTAL (Fractal Wealth)</w:t>
+        <w:t xml:space="preserve">Combine Capital</w:t>
       </w:r>
       <w:r>
         <w:t xml:space="preserve"> </w:t>
@@ -295,7 +328,7 @@
         <w:rPr>
           <w:i/>
         </w:rPr>
-        <w:t xml:space="preserve">January 2021 - January 2022</w:t>
+        <w:t xml:space="preserve">January 2023 - Present</w:t>
       </w:r>
     </w:p>
     <w:p>
@@ -307,7 +340,22 @@
         <w:pStyle w:val="Compact"/>
       </w:pPr>
       <w:r>
-        <w:t xml:space="preserve">Designed and deployed automated crypto/DeFi trading strategies</w:t>
+        <w:t xml:space="preserve">Implemented a robust multi-agent system that streamlined data processing, achieving a</w:t>
+      </w:r>
+      <w:r>
+        <w:t xml:space="preserve"> </w:t>
+      </w:r>
+      <w:r>
+        <w:rPr>
+          <w:b/>
+        </w:rPr>
+        <w:t xml:space="preserve">75% reduction in analysis time</w:t>
+      </w:r>
+      <w:r>
+        <w:t xml:space="preserve"> </w:t>
+      </w:r>
+      <w:r>
+        <w:t xml:space="preserve">and increasing decision-making speed within 3 months</w:t>
       </w:r>
     </w:p>
     <w:p>
@@ -319,19 +367,22 @@
         <w:pStyle w:val="Compact"/>
       </w:pPr>
       <w:r>
-        <w:t xml:space="preserve">Developed a backtesting framework that processed</w:t>
-      </w:r>
-      <w:r>
-        <w:t xml:space="preserve"> </w:t>
-      </w:r>
-      <w:r>
-        <w:rPr>
-          <w:b/>
-        </w:rPr>
-        <w:t xml:space="preserve">5+ years of historical data</w:t>
-      </w:r>
-      <w:r>
-        <w:t xml:space="preserve">, enhancing strategy validation and performance analysis within 4 months</w:t>
+        <w:t xml:space="preserve">Fine-tuned LLMs to explain complex DeFi transactions in plain English, improving investigation efficiency by</w:t>
+      </w:r>
+      <w:r>
+        <w:t xml:space="preserve"> </w:t>
+      </w:r>
+      <w:r>
+        <w:rPr>
+          <w:b/>
+        </w:rPr>
+        <w:t xml:space="preserve">65%</w:t>
+      </w:r>
+      <w:r>
+        <w:t xml:space="preserve"> </w:t>
+      </w:r>
+      <w:r>
+        <w:t xml:space="preserve">for compliance reviews</w:t>
       </w:r>
     </w:p>
     <w:p>
@@ -343,31 +394,64 @@
         <w:pStyle w:val="Compact"/>
       </w:pPr>
       <w:r>
-        <w:t xml:space="preserve">Engineered risk management systems with dynamic position sizing, reducing potential losses by</w:t>
-      </w:r>
-      <w:r>
-        <w:t xml:space="preserve"> </w:t>
-      </w:r>
-      <w:r>
-        <w:rPr>
-          <w:b/>
-        </w:rPr>
-        <w:t xml:space="preserve">40%</w:t>
-      </w:r>
-      <w:r>
-        <w:t xml:space="preserve"> </w:t>
-      </w:r>
-      <w:r>
-        <w:t xml:space="preserve">within 4 months through advanced algorithmic strategies</w:t>
+        <w:t xml:space="preserve">Built ReAct-based agentic workflow automation for complex DeFi transactions, integrating dynamic slippage optimization and MEV protection across</w:t>
+      </w:r>
+      <w:r>
+        <w:t xml:space="preserve"> </w:t>
+      </w:r>
+      <w:r>
+        <w:rPr>
+          <w:b/>
+        </w:rPr>
+        <w:t xml:space="preserve">10+ protocols</w:t>
+      </w:r>
+    </w:p>
+    <w:p>
+      <w:pPr>
+        <w:numPr>
+          <w:ilvl w:val="0"/>
+          <w:numId w:val="1002"/>
+        </w:numPr>
+        <w:pStyle w:val="Compact"/>
+      </w:pPr>
+      <w:r>
+        <w:t xml:space="preserve">Developed an end-to-end data infrastructure that processed</w:t>
+      </w:r>
+      <w:r>
+        <w:t xml:space="preserve"> </w:t>
+      </w:r>
+      <w:r>
+        <w:rPr>
+          <w:b/>
+        </w:rPr>
+        <w:t xml:space="preserve">100K+ daily events</w:t>
+      </w:r>
+      <w:r>
+        <w:t xml:space="preserve"> </w:t>
+      </w:r>
+      <w:r>
+        <w:t xml:space="preserve">across multiple EVM chains and CEXs, enhancing data accessibility within 6 months</w:t>
+      </w:r>
+    </w:p>
+    <w:p>
+      <w:pPr>
+        <w:numPr>
+          <w:ilvl w:val="0"/>
+          <w:numId w:val="1002"/>
+        </w:numPr>
+        <w:pStyle w:val="Compact"/>
+      </w:pPr>
+      <w:r>
+        <w:t xml:space="preserve">Led technical due diligence for portfolio investments</w:t>
       </w:r>
     </w:p>
     <w:p>
       <w:pPr>
         <w:pStyle w:val="Heading3"/>
       </w:pPr>
-      <w:bookmarkStart w:id="28" w:name="founder-chief-technology-officer"/>
-      <w:r>
-        <w:t xml:space="preserve">Founder &amp; Chief Technology Officer</w:t>
+      <w:bookmarkStart w:id="28" w:name="software-engineer"/>
+      <w:r>
+        <w:t xml:space="preserve">Software Engineer</w:t>
       </w:r>
       <w:bookmarkEnd w:id="28"/>
     </w:p>
@@ -379,7 +463,7 @@
         <w:rPr>
           <w:b/>
         </w:rPr>
-        <w:t xml:space="preserve">Cryptosheets</w:t>
+        <w:t xml:space="preserve">FRACTAL (Fractal Wealth)</w:t>
       </w:r>
       <w:r>
         <w:t xml:space="preserve"> </w:t>
@@ -394,7 +478,7 @@
         <w:rPr>
           <w:i/>
         </w:rPr>
-        <w:t xml:space="preserve">January 2018 - January 2021</w:t>
+        <w:t xml:space="preserve">January 2021 - January 2022</w:t>
       </w:r>
     </w:p>
     <w:p>
@@ -406,22 +490,7 @@
         <w:pStyle w:val="Compact"/>
       </w:pPr>
       <w:r>
-        <w:t xml:space="preserve">Scaled a data platform to over</w:t>
-      </w:r>
-      <w:r>
-        <w:t xml:space="preserve"> </w:t>
-      </w:r>
-      <w:r>
-        <w:rPr>
-          <w:b/>
-        </w:rPr>
-        <w:t xml:space="preserve">30,000 active users</w:t>
-      </w:r>
-      <w:r>
-        <w:t xml:space="preserve"> </w:t>
-      </w:r>
-      <w:r>
-        <w:t xml:space="preserve">within 12 months by implementing targeted marketing strategies and enhancing user experience</w:t>
+        <w:t xml:space="preserve">Designed and deployed automated crypto/DeFi trading strategies</w:t>
       </w:r>
     </w:p>
     <w:p>
@@ -433,7 +502,19 @@
         <w:pStyle w:val="Compact"/>
       </w:pPr>
       <w:r>
-        <w:t xml:space="preserve">Developed a Microsoft Excel add-in for real-time crypto market data, enhancing user decision-making speed and accuracy through custom APIs within 3 months</w:t>
+        <w:t xml:space="preserve">Developed a backtesting framework that processed</w:t>
+      </w:r>
+      <w:r>
+        <w:t xml:space="preserve"> </w:t>
+      </w:r>
+      <w:r>
+        <w:rPr>
+          <w:b/>
+        </w:rPr>
+        <w:t xml:space="preserve">5+ years of historical data</w:t>
+      </w:r>
+      <w:r>
+        <w:t xml:space="preserve">, enhancing strategy validation and performance analysis within 4 months</w:t>
       </w:r>
     </w:p>
     <w:p>
@@ -445,16 +526,31 @@
         <w:pStyle w:val="Compact"/>
       </w:pPr>
       <w:r>
-        <w:t xml:space="preserve">Led successful exit to private buyer within first year</w:t>
+        <w:t xml:space="preserve">Engineered risk management systems with dynamic position sizing, reducing potential losses by</w:t>
+      </w:r>
+      <w:r>
+        <w:t xml:space="preserve"> </w:t>
+      </w:r>
+      <w:r>
+        <w:rPr>
+          <w:b/>
+        </w:rPr>
+        <w:t xml:space="preserve">40%</w:t>
+      </w:r>
+      <w:r>
+        <w:t xml:space="preserve"> </w:t>
+      </w:r>
+      <w:r>
+        <w:t xml:space="preserve">within 4 months through advanced algorithmic strategies</w:t>
       </w:r>
     </w:p>
     <w:p>
       <w:pPr>
         <w:pStyle w:val="Heading3"/>
       </w:pPr>
-      <w:bookmarkStart w:id="29" w:name="founder-chief-software-architect"/>
-      <w:r>
-        <w:t xml:space="preserve">Founder &amp; Chief Software Architect</w:t>
+      <w:bookmarkStart w:id="29" w:name="founder-chief-technology-officer"/>
+      <w:r>
+        <w:t xml:space="preserve">Founder &amp; Chief Technology Officer</w:t>
       </w:r>
       <w:bookmarkEnd w:id="29"/>
     </w:p>
@@ -466,7 +562,7 @@
         <w:rPr>
           <w:b/>
         </w:rPr>
-        <w:t xml:space="preserve">Spreadstreet.io</w:t>
+        <w:t xml:space="preserve">Cryptosheets</w:t>
       </w:r>
       <w:r>
         <w:t xml:space="preserve"> </w:t>
@@ -481,7 +577,7 @@
         <w:rPr>
           <w:i/>
         </w:rPr>
-        <w:t xml:space="preserve">January 2016 - January 2019</w:t>
+        <w:t xml:space="preserve">January 2018 - January 2021</w:t>
       </w:r>
     </w:p>
     <w:p>
@@ -493,22 +589,22 @@
         <w:pStyle w:val="Compact"/>
       </w:pPr>
       <w:r>
-        <w:t xml:space="preserve">Built subscriber base of</w:t>
-      </w:r>
-      <w:r>
-        <w:t xml:space="preserve"> </w:t>
-      </w:r>
-      <w:r>
-        <w:rPr>
-          <w:b/>
-        </w:rPr>
-        <w:t xml:space="preserve">5,000+ users</w:t>
-      </w:r>
-      <w:r>
-        <w:t xml:space="preserve"> </w:t>
-      </w:r>
-      <w:r>
-        <w:t xml:space="preserve">with recurring revenue</w:t>
+        <w:t xml:space="preserve">Scaled a data platform to over</w:t>
+      </w:r>
+      <w:r>
+        <w:t xml:space="preserve"> </w:t>
+      </w:r>
+      <w:r>
+        <w:rPr>
+          <w:b/>
+        </w:rPr>
+        <w:t xml:space="preserve">30,000 active users</w:t>
+      </w:r>
+      <w:r>
+        <w:t xml:space="preserve"> </w:t>
+      </w:r>
+      <w:r>
+        <w:t xml:space="preserve">within 12 months by implementing targeted marketing strategies and enhancing user experience</w:t>
       </w:r>
     </w:p>
     <w:p>
@@ -520,16 +616,28 @@
         <w:pStyle w:val="Compact"/>
       </w:pPr>
       <w:r>
-        <w:t xml:space="preserve">Negotiated and completed exit to strategic buyer</w:t>
+        <w:t xml:space="preserve">Developed a Microsoft Excel add-in for real-time crypto market data, enhancing user decision-making speed and accuracy through custom APIs within 3 months</w:t>
+      </w:r>
+    </w:p>
+    <w:p>
+      <w:pPr>
+        <w:numPr>
+          <w:ilvl w:val="0"/>
+          <w:numId w:val="1004"/>
+        </w:numPr>
+        <w:pStyle w:val="Compact"/>
+      </w:pPr>
+      <w:r>
+        <w:t xml:space="preserve">Led successful exit to private buyer within first year</w:t>
       </w:r>
     </w:p>
     <w:p>
       <w:pPr>
         <w:pStyle w:val="Heading3"/>
       </w:pPr>
-      <w:bookmarkStart w:id="30" w:name="principal-financial-analyst"/>
-      <w:r>
-        <w:t xml:space="preserve">Principal Financial Analyst</w:t>
+      <w:bookmarkStart w:id="30" w:name="founder-chief-software-architect"/>
+      <w:r>
+        <w:t xml:space="preserve">Founder &amp; Chief Software Architect</w:t>
       </w:r>
       <w:bookmarkEnd w:id="30"/>
     </w:p>
@@ -541,7 +649,7 @@
         <w:rPr>
           <w:b/>
         </w:rPr>
-        <w:t xml:space="preserve">Capital One</w:t>
+        <w:t xml:space="preserve">Spreadstreet.io</w:t>
       </w:r>
       <w:r>
         <w:t xml:space="preserve"> </w:t>
@@ -556,18 +664,7 @@
         <w:rPr>
           <w:i/>
         </w:rPr>
-        <w:t xml:space="preserve">January 2010 - January 2017</w:t>
-      </w:r>
-    </w:p>
-    <w:p>
-      <w:pPr>
-        <w:pStyle w:val="BodyText"/>
-      </w:pPr>
-      <w:r>
-        <w:rPr>
-          <w:i/>
-        </w:rPr>
-        <w:t xml:space="preserve">Progressive roles: Finance Rotation → Senior Analyst → Principal Analyst</w:t>
+        <w:t xml:space="preserve">January 2016 - January 2019</w:t>
       </w:r>
     </w:p>
     <w:p>
@@ -579,16 +676,22 @@
         <w:pStyle w:val="Compact"/>
       </w:pPr>
       <w:r>
-        <w:t xml:space="preserve">Led cross-functional teams developing financial models for</w:t>
-      </w:r>
-      <w:r>
-        <w:t xml:space="preserve"> </w:t>
-      </w:r>
-      <w:r>
-        <w:rPr>
-          <w:b/>
-        </w:rPr>
-        <w:t xml:space="preserve">$1B+ credit portfolio</w:t>
+        <w:t xml:space="preserve">Built subscriber base of</w:t>
+      </w:r>
+      <w:r>
+        <w:t xml:space="preserve"> </w:t>
+      </w:r>
+      <w:r>
+        <w:rPr>
+          <w:b/>
+        </w:rPr>
+        <w:t xml:space="preserve">5,000+ users</w:t>
+      </w:r>
+      <w:r>
+        <w:t xml:space="preserve"> </w:t>
+      </w:r>
+      <w:r>
+        <w:t xml:space="preserve">with recurring revenue</w:t>
       </w:r>
     </w:p>
     <w:p>
@@ -600,6 +703,86 @@
         <w:pStyle w:val="Compact"/>
       </w:pPr>
       <w:r>
+        <w:t xml:space="preserve">Negotiated and completed exit to strategic buyer</w:t>
+      </w:r>
+    </w:p>
+    <w:p>
+      <w:pPr>
+        <w:pStyle w:val="Heading3"/>
+      </w:pPr>
+      <w:bookmarkStart w:id="31" w:name="principal-financial-analyst"/>
+      <w:r>
+        <w:t xml:space="preserve">Principal Financial Analyst</w:t>
+      </w:r>
+      <w:bookmarkEnd w:id="31"/>
+    </w:p>
+    <w:p>
+      <w:pPr>
+        <w:pStyle w:val="FirstParagraph"/>
+      </w:pPr>
+      <w:r>
+        <w:rPr>
+          <w:b/>
+        </w:rPr>
+        <w:t xml:space="preserve">Capital One</w:t>
+      </w:r>
+      <w:r>
+        <w:t xml:space="preserve"> </w:t>
+      </w:r>
+      <w:r>
+        <w:t xml:space="preserve">•</w:t>
+      </w:r>
+      <w:r>
+        <w:t xml:space="preserve"> </w:t>
+      </w:r>
+      <w:r>
+        <w:rPr>
+          <w:i/>
+        </w:rPr>
+        <w:t xml:space="preserve">January 2010 - January 2017</w:t>
+      </w:r>
+    </w:p>
+    <w:p>
+      <w:pPr>
+        <w:pStyle w:val="BodyText"/>
+      </w:pPr>
+      <w:r>
+        <w:rPr>
+          <w:i/>
+        </w:rPr>
+        <w:t xml:space="preserve">Progressive roles: Finance Rotation → Senior Analyst → Principal Analyst</w:t>
+      </w:r>
+    </w:p>
+    <w:p>
+      <w:pPr>
+        <w:numPr>
+          <w:ilvl w:val="0"/>
+          <w:numId w:val="1006"/>
+        </w:numPr>
+        <w:pStyle w:val="Compact"/>
+      </w:pPr>
+      <w:r>
+        <w:t xml:space="preserve">Led cross-functional teams developing financial models for</w:t>
+      </w:r>
+      <w:r>
+        <w:t xml:space="preserve"> </w:t>
+      </w:r>
+      <w:r>
+        <w:rPr>
+          <w:b/>
+        </w:rPr>
+        <w:t xml:space="preserve">$1B+ credit portfolio</w:t>
+      </w:r>
+    </w:p>
+    <w:p>
+      <w:pPr>
+        <w:numPr>
+          <w:ilvl w:val="0"/>
+          <w:numId w:val="1006"/>
+        </w:numPr>
+        <w:pStyle w:val="Compact"/>
+      </w:pPr>
+      <w:r>
         <w:t xml:space="preserve">Developed predictive models for customer acquisition and retention</w:t>
       </w:r>
     </w:p>
@@ -614,11 +797,11 @@
       <w:pPr>
         <w:pStyle w:val="Heading2"/>
       </w:pPr>
-      <w:bookmarkStart w:id="31" w:name="technical-skills"/>
+      <w:bookmarkStart w:id="32" w:name="technical-skills"/>
       <w:r>
         <w:t xml:space="preserve">TECHNICAL SKILLS</w:t>
       </w:r>
-      <w:bookmarkEnd w:id="31"/>
+      <w:bookmarkEnd w:id="32"/>
     </w:p>
     <w:tbl>
       <w:tblPr>
@@ -924,11 +1107,11 @@
       <w:pPr>
         <w:pStyle w:val="Heading2"/>
       </w:pPr>
-      <w:bookmarkStart w:id="32" w:name="education"/>
+      <w:bookmarkStart w:id="33" w:name="education"/>
       <w:r>
         <w:t xml:space="preserve">EDUCATION</w:t>
       </w:r>
-      <w:bookmarkEnd w:id="32"/>
+      <w:bookmarkEnd w:id="33"/>
     </w:p>
     <w:p>
       <w:pPr>
@@ -1011,11 +1194,11 @@
       <w:pPr>
         <w:pStyle w:val="Heading2"/>
       </w:pPr>
-      <w:bookmarkStart w:id="33" w:name="certifications"/>
+      <w:bookmarkStart w:id="34" w:name="certifications"/>
       <w:r>
         <w:t xml:space="preserve">CERTIFICATIONS</w:t>
       </w:r>
-      <w:bookmarkEnd w:id="33"/>
+      <w:bookmarkEnd w:id="34"/>
     </w:p>
     <w:p>
       <w:pPr>
@@ -1054,11 +1237,11 @@
       <w:pPr>
         <w:pStyle w:val="Heading2"/>
       </w:pPr>
-      <w:bookmarkStart w:id="34" w:name="publications"/>
+      <w:bookmarkStart w:id="35" w:name="publications"/>
       <w:r>
         <w:t xml:space="preserve">PUBLICATIONS</w:t>
       </w:r>
-      <w:bookmarkEnd w:id="34"/>
+      <w:bookmarkEnd w:id="35"/>
     </w:p>
     <w:p>
       <w:pPr>
@@ -1075,7 +1258,7 @@
       <w:pPr>
         <w:numPr>
           <w:ilvl w:val="0"/>
-          <w:numId w:val="1006"/>
+          <w:numId w:val="1007"/>
         </w:numPr>
         <w:pStyle w:val="Compact"/>
       </w:pPr>
@@ -1093,7 +1276,7 @@
       <w:pPr>
         <w:numPr>
           <w:ilvl w:val="0"/>
-          <w:numId w:val="1006"/>
+          <w:numId w:val="1007"/>
         </w:numPr>
         <w:pStyle w:val="Compact"/>
       </w:pPr>
@@ -1111,7 +1294,7 @@
       <w:pPr>
         <w:numPr>
           <w:ilvl w:val="0"/>
-          <w:numId w:val="1006"/>
+          <w:numId w:val="1007"/>
         </w:numPr>
         <w:pStyle w:val="Compact"/>
       </w:pPr>
@@ -1374,6 +1557,9 @@
     <w:abstractNumId w:val="991"/>
   </w:num>
   <w:num w:numId="1006">
+    <w:abstractNumId w:val="991"/>
+  </w:num>
+  <w:num w:numId="1007">
     <w:abstractNumId w:val="991"/>
   </w:num>
 </w:numbering>

</xml_diff>